<commit_message>
Add author details to the ISR title page and cover letter (manuscript stays anonymous)
Co-Authored-By: Claude Sonnet 5.5 <noreply@anthropic.com>
Claude-Session: https://claude.ai/code/session_01FLb7uVf7YBgdoa75gbZ2sf
</commit_message>
<xml_diff>
--- a/paper/ISR_Cover_Letter_and_Title_Page.docx
+++ b/paper/ISR_Cover_Letter_and_Title_Page.docx
@@ -76,13 +76,13 @@
           <w:bCs/>
           <w:b/>
         </w:rPr>
-        <w:t xml:space="preserve">Authors:</w:t>
-      </w:r>
-      <w:r>
-        <w:t xml:space="preserve"> </w:t>
-      </w:r>
-      <w:r>
-        <w:t xml:space="preserve">[Author 1 name, affiliation, email]; [Author 2 name, affiliation, email]</w:t>
+        <w:t xml:space="preserve">Author:</w:t>
+      </w:r>
+      <w:r>
+        <w:t xml:space="preserve"> </w:t>
+      </w:r>
+      <w:r>
+        <w:t xml:space="preserve">Ook Lee, Department of Information Systems, Hanyang University, Seoul, Korea. Email: ooklee@hanyang.ac.kr</w:t>
       </w:r>
     </w:p>
     <w:p>
@@ -100,7 +100,7 @@
         <w:t xml:space="preserve"> </w:t>
       </w:r>
       <w:r>
-        <w:t xml:space="preserve">[name, postal address, email, telephone]</w:t>
+        <w:t xml:space="preserve">Ook Lee, Department of Information Systems, Hanyang University, Seoul, Korea. Email: ooklee@hanyang.ac.kr. [Add postal address and telephone if the submission system asks for them.]</w:t>
       </w:r>
     </w:p>
     <w:p>
@@ -136,7 +136,7 @@
         <w:t xml:space="preserve"> </w:t>
       </w:r>
       <w:r>
-        <w:t xml:space="preserve">[Generative AI (Anthropic’s Claude) was used to write and run the data-collection and analysis code and to draft and edit the text. The authors designed the research questions, reviewed all code, results, and text, verified the references, and take full responsibility for the content.]</w:t>
+        <w:t xml:space="preserve">[Generative AI (Anthropic’s Claude) was used to write and run the data-collection and analysis code and to draft and edit the text. The author designed the research questions, reviewed all code, results, and text, verified the references, and takes full responsibility for the content.]</w:t>
       </w:r>
     </w:p>
     <w:bookmarkEnd w:id="20"/>
@@ -209,7 +209,7 @@
         <w:pStyle w:val="BodyText"/>
       </w:pPr>
       <w:r>
-        <w:t xml:space="preserve">The manuscript is original, has not been published, and is not under review elsewhere. It has been prepared for double-blind review: the authors’ names and affiliations appear only on a separate title page, and the manuscript contains no identifying information. The empirical data come from public sources (the open-access subset of PubMed Central and arXiv) and from text generated by commercial and open-weight language models. The analysis code, prompts, and generated papers will be made available in a public repository upon acceptance. [The authors declare no conflicts of interest. Confirm before submission.]</w:t>
+        <w:t xml:space="preserve">The manuscript is original, has not been published, and is not under review elsewhere. It has been prepared for double-blind review: the author’s name and affiliation appear only on a separate title page, and the manuscript contains no identifying information. The empirical data come from public sources (the open-access subset of PubMed Central and arXiv) and from text generated by commercial and open-weight language models. The analysis code, prompts, and generated papers will be made available in a public repository upon acceptance. [The author declares no conflicts of interest. Confirm before submission.]</w:t>
       </w:r>
     </w:p>
     <w:p>
@@ -233,7 +233,19 @@
         <w:pStyle w:val="BodyText"/>
       </w:pPr>
       <w:r>
-        <w:t xml:space="preserve">[Corresponding author name]</w:t>
+        <w:t xml:space="preserve">Ook Lee</w:t>
+      </w:r>
+      <w:r>
+        <w:t xml:space="preserve"> </w:t>
+      </w:r>
+      <w:r>
+        <w:t xml:space="preserve">Department of Information Systems, Hanyang University, Seoul, Korea</w:t>
+      </w:r>
+      <w:r>
+        <w:t xml:space="preserve"> </w:t>
+      </w:r>
+      <w:r>
+        <w:t xml:space="preserve">ooklee@hanyang.ac.kr</w:t>
       </w:r>
     </w:p>
     <w:bookmarkEnd w:id="21"/>
@@ -409,7 +421,70 @@
         <w:pStyle w:val="Compact"/>
       </w:pPr>
       <w:r>
-        <w:t xml:space="preserve">☐ Complete the AI-assistance disclosure according to INFORMS policy, and confirm that the authors have reviewed all numbers and interpretations.</w:t>
+        <w:t xml:space="preserve">☐ Complete the AI-assistance disclosure according to INFORMS policy, and confirm that you have reviewed all numbers and interpretations.</w:t>
+      </w:r>
+    </w:p>
+    <w:p>
+      <w:pPr>
+        <w:numPr>
+          <w:ilvl w:val="0"/>
+          <w:numId w:val="1001"/>
+        </w:numPr>
+        <w:pStyle w:val="Compact"/>
+      </w:pPr>
+      <w:r>
+        <w:t xml:space="preserve">☐ Decide whether to keep</w:t>
+      </w:r>
+      <w:r>
+        <w:t xml:space="preserve"> </w:t>
+      </w:r>
+      <w:r>
+        <w:t xml:space="preserve">“</w:t>
+      </w:r>
+      <w:r>
+        <w:t xml:space="preserve">we</w:t>
+      </w:r>
+      <w:r>
+        <w:t xml:space="preserve">”</w:t>
+      </w:r>
+      <w:r>
+        <w:t xml:space="preserve"> </w:t>
+      </w:r>
+      <w:r>
+        <w:t xml:space="preserve">in the manuscript or change it to</w:t>
+      </w:r>
+      <w:r>
+        <w:t xml:space="preserve"> </w:t>
+      </w:r>
+      <w:r>
+        <w:t xml:space="preserve">“</w:t>
+      </w:r>
+      <w:r>
+        <w:t xml:space="preserve">I</w:t>
+      </w:r>
+      <w:r>
+        <w:t xml:space="preserve">”</w:t>
+      </w:r>
+      <w:r>
+        <w:t xml:space="preserve"> </w:t>
+      </w:r>
+      <w:r>
+        <w:t xml:space="preserve">for a sole-authored paper (the manuscript and the contribution statement use</w:t>
+      </w:r>
+      <w:r>
+        <w:t xml:space="preserve"> </w:t>
+      </w:r>
+      <w:r>
+        <w:t xml:space="preserve">“</w:t>
+      </w:r>
+      <w:r>
+        <w:t xml:space="preserve">we</w:t>
+      </w:r>
+      <w:r>
+        <w:t xml:space="preserve">”</w:t>
+      </w:r>
+      <w:r>
+        <w:t xml:space="preserve">; if there are co-authors, add them to the title page).</w:t>
       </w:r>
     </w:p>
     <w:p>

</xml_diff>

<commit_message>
Fix department name on title page and cover letter
Co-Authored-By: Claude Sonnet 5.5 <noreply@anthropic.com>
Claude-Session: https://claude.ai/code/session_01FLb7uVf7YBgdoa75gbZ2sf
</commit_message>
<xml_diff>
--- a/paper/ISR_Cover_Letter_and_Title_Page.docx
+++ b/paper/ISR_Cover_Letter_and_Title_Page.docx
@@ -82,7 +82,7 @@
         <w:t xml:space="preserve"> </w:t>
       </w:r>
       <w:r>
-        <w:t xml:space="preserve">Ook Lee, Department of Information Systems, Hanyang University, Seoul, Korea. Email: ooklee@hanyang.ac.kr</w:t>
+        <w:t xml:space="preserve">Ook Lee, Department of Information System, Hanyang University, Seoul, Korea. Email: ooklee@hanyang.ac.kr</w:t>
       </w:r>
     </w:p>
     <w:p>
@@ -100,7 +100,7 @@
         <w:t xml:space="preserve"> </w:t>
       </w:r>
       <w:r>
-        <w:t xml:space="preserve">Ook Lee, Department of Information Systems, Hanyang University, Seoul, Korea. Email: ooklee@hanyang.ac.kr. [Add postal address and telephone if the submission system asks for them.]</w:t>
+        <w:t xml:space="preserve">Ook Lee, Department of Information System, Hanyang University, Seoul, Korea. Email: ooklee@hanyang.ac.kr. [Add postal address and telephone if the submission system asks for them.]</w:t>
       </w:r>
     </w:p>
     <w:p>
@@ -239,7 +239,7 @@
         <w:t xml:space="preserve"> </w:t>
       </w:r>
       <w:r>
-        <w:t xml:space="preserve">Department of Information Systems, Hanyang University, Seoul, Korea</w:t>
+        <w:t xml:space="preserve">Department of Information System, Hanyang University, Seoul, Korea</w:t>
       </w:r>
       <w:r>
         <w:t xml:space="preserve"> </w:t>

</xml_diff>